<commit_message>
Ship Socratic tutor, mission upgrades, 3D lab fixes, and docs.
Rewrite the AI tutor for glossary taps (ask what you think, then evaluate with structured compare), add markdown rendering in chat, and harden the Groq proxy phases. Fix 3D Specimen Lab space textures and mouth model; refresh README and A4 feature sheets.
</commit_message>
<xml_diff>
--- a/GyanQuest_Project_Report.docx
+++ b/GyanQuest_Project_Report.docx
@@ -1,6 +1,6 @@
 
 <file path=word/document.xml><?xml version="1.0" encoding="utf-8"?>
-<w:document xmlns:wpc="http://schemas.microsoft.com/office/word/2010/wordprocessingCanvas" xmlns:cx="http://schemas.microsoft.com/office/drawing/2014/chartex" xmlns:cx1="http://schemas.microsoft.com/office/drawing/2015/9/8/chartex" xmlns:cx2="http://schemas.microsoft.com/office/drawing/2015/10/21/chartex" xmlns:cx3="http://schemas.microsoft.com/office/drawing/2016/5/9/chartex" xmlns:cx4="http://schemas.microsoft.com/office/drawing/2016/5/10/chartex" xmlns:cx5="http://schemas.microsoft.com/office/drawing/2016/5/11/chartex" xmlns:cx6="http://schemas.microsoft.com/office/drawing/2016/5/12/chartex" xmlns:cx7="http://schemas.microsoft.com/office/drawing/2016/5/13/chartex" xmlns:cx8="http://schemas.microsoft.com/office/drawing/2016/5/14/chartex" xmlns:mc="http://schemas.openxmlformats.org/markup-compatibility/2006" xmlns:aink="http://schemas.microsoft.com/office/drawing/2016/ink" xmlns:am3d="http://schemas.microsoft.com/office/drawing/2017/model3d" xmlns:o="urn:schemas-microsoft-com:office:office" xmlns:oel="http://schemas.microsoft.com/office/2019/extlst" xmlns:r="http://schemas.openxmlformats.org/officeDocument/2006/relationships" xmlns:m="http://schemas.openxmlformats.org/officeDocument/2006/math" xmlns:v="urn:schemas-microsoft-com:vml" xmlns:wp14="http://schemas.microsoft.com/office/word/2010/wordprocessingDrawing" xmlns:wp="http://schemas.openxmlformats.org/drawingml/2006/wordprocessingDrawing" xmlns:w10="urn:schemas-microsoft-com:office:word" xmlns:w="http://schemas.openxmlformats.org/wordprocessingml/2006/main" xmlns:w14="http://schemas.microsoft.com/office/word/2010/wordml" xmlns:w15="http://schemas.microsoft.com/office/word/2012/wordml" xmlns:w16cei="http://schemas.microsoft.com/office/word/2026/wordml/cei" xmlns:w16cex="http://schemas.microsoft.com/office/word/2018/wordml/cex" xmlns:w16cid="http://schemas.microsoft.com/office/word/2016/wordml/cid" xmlns:w16="http://schemas.microsoft.com/office/word/2018/wordml" xmlns:w16du="http://schemas.microsoft.com/office/word/2023/wordml/word16du" xmlns:w16sdtdh="http://schemas.microsoft.com/office/word/2020/wordml/sdtdatahash" xmlns:w16sdtfl="http://schemas.microsoft.com/office/word/2024/wordml/sdtformatlock" xmlns:w16se="http://schemas.microsoft.com/office/word/2015/wordml/symex" xmlns:wpg="http://schemas.microsoft.com/office/word/2010/wordprocessingGroup" xmlns:wpi="http://schemas.microsoft.com/office/word/2010/wordprocessingInk" xmlns:wne="http://schemas.microsoft.com/office/word/2006/wordml" xmlns:wps="http://schemas.microsoft.com/office/word/2010/wordprocessingShape" mc:Ignorable="w14 w15 w16se w16cid w16 w16cex w16sdtdh w16sdtfl w16du wp14">
+<w:document xmlns:wpc="http://schemas.microsoft.com/office/word/2010/wordprocessingCanvas" xmlns:cx="http://schemas.microsoft.com/office/drawing/2014/chartex" xmlns:cx1="http://schemas.microsoft.com/office/drawing/2015/9/8/chartex" xmlns:cx2="http://schemas.microsoft.com/office/drawing/2015/10/21/chartex" xmlns:cx3="http://schemas.microsoft.com/office/drawing/2016/5/9/chartex" xmlns:cx4="http://schemas.microsoft.com/office/drawing/2016/5/10/chartex" xmlns:cx5="http://schemas.microsoft.com/office/drawing/2016/5/11/chartex" xmlns:cx6="http://schemas.microsoft.com/office/drawing/2016/5/12/chartex" xmlns:cx7="http://schemas.microsoft.com/office/drawing/2016/5/13/chartex" xmlns:cx8="http://schemas.microsoft.com/office/drawing/2016/5/14/chartex" xmlns:mc="http://schemas.openxmlformats.org/markup-compatibility/2006" xmlns:aink="http://schemas.microsoft.com/office/drawing/2016/ink" xmlns:am3d="http://schemas.microsoft.com/office/drawing/2017/model3d" xmlns:o="urn:schemas-microsoft-com:office:office" xmlns:oel="http://schemas.microsoft.com/office/2019/extlst" xmlns:r="http://schemas.openxmlformats.org/officeDocument/2006/relationships" xmlns:m="http://schemas.openxmlformats.org/officeDocument/2006/math" xmlns:v="urn:schemas-microsoft-com:vml" xmlns:wp14="http://schemas.microsoft.com/office/word/2010/wordprocessingDrawing" xmlns:wp="http://schemas.openxmlformats.org/drawingml/2006/wordprocessingDrawing" xmlns:w10="urn:schemas-microsoft-com:office:word" xmlns:w="http://schemas.openxmlformats.org/wordprocessingml/2006/main" xmlns:w14="http://schemas.microsoft.com/office/word/2010/wordml" xmlns:w15="http://schemas.microsoft.com/office/word/2012/wordml" xmlns:w16cex="http://schemas.microsoft.com/office/word/2018/wordml/cex" xmlns:w16cid="http://schemas.microsoft.com/office/word/2016/wordml/cid" xmlns:w16="http://schemas.microsoft.com/office/word/2018/wordml" xmlns:w16du="http://schemas.microsoft.com/office/word/2023/wordml/word16du" xmlns:w16sdtdh="http://schemas.microsoft.com/office/word/2020/wordml/sdtdatahash" xmlns:w16sdtfl="http://schemas.microsoft.com/office/word/2024/wordml/sdtformatlock" xmlns:w16se="http://schemas.microsoft.com/office/word/2015/wordml/symex" xmlns:wpg="http://schemas.microsoft.com/office/word/2010/wordprocessingGroup" xmlns:wpi="http://schemas.microsoft.com/office/word/2010/wordprocessingInk" xmlns:wne="http://schemas.microsoft.com/office/word/2006/wordml" xmlns:wps="http://schemas.microsoft.com/office/word/2010/wordprocessingShape" mc:Ignorable="w14 w15 w16se w16cid w16 w16cex w16sdtdh w16sdtfl w16du wp14">
   <w:body>
     <w:tbl>
       <w:tblPr>
@@ -777,7 +777,7 @@
           <w:rFonts w:ascii="Calibri" w:eastAsia="Calibri" w:hAnsi="Calibri"/>
           <w:color w:val="1B2838"/>
         </w:rPr>
-        <w:t>11. AI tutor (optional, never blocking)</w:t>
+        <w:t xml:space="preserve">11. AI tutor </w:t>
       </w:r>
     </w:p>
     <w:p>
@@ -1058,7 +1058,7 @@
                 <w:color w:val="1B2838"/>
                 <w:sz w:val="20"/>
               </w:rPr>
-              <w:t>25</w:t>
+              <w:t>52</w:t>
             </w:r>
           </w:p>
         </w:tc>
@@ -1866,13 +1866,21 @@
     <w:p>
       <w:pPr>
         <w:pStyle w:val="Heading1"/>
+        <w:rPr>
+          <w:rFonts w:ascii="Calibri" w:hAnsi="Calibri"/>
+          <w:color w:val="1E4D6B"/>
+        </w:rPr>
+      </w:pPr>
+    </w:p>
+    <w:p>
+      <w:pPr>
+        <w:pStyle w:val="Heading1"/>
       </w:pPr>
       <w:r>
         <w:rPr>
           <w:rFonts w:ascii="Calibri" w:hAnsi="Calibri"/>
           <w:color w:val="1E4D6B"/>
         </w:rPr>
-        <w:lastRenderedPageBreak/>
         <w:t>6. Pedagogy and learning design</w:t>
       </w:r>
     </w:p>
@@ -1886,7 +1894,7 @@
           <w:rFonts w:ascii="Calibri" w:eastAsia="Calibri" w:hAnsi="Calibri"/>
           <w:color w:val="1B2838"/>
         </w:rPr>
-        <w:t>Each topic follows a ten-step spiral copied from the Force Fighter pattern: hook, watch, sort, try, explain, name the rule, stretch, myth-bust, fluency drill, mastery. Difficulty rises inside a topic; it does not jump to 'level 10 equals the hardest chapter of the whole subject.'</w:t>
+        <w:t>Each topic follows a Bruner spiral packed into ten engine steps. Flagship missions (Force Fighter, Electrical Basics, ICT Fundamentals Mission 1, Chemistry Lab, and others) use an explicit Opening plus four Enactive/Iconic/Symbolic loops and a recap map. All finished missions gate Mastery behind an 80% fluency drill. Difficulty rises inside a topic; it does not jump to 'level 10 equals the hardest chapter of the whole subject.'</w:t>
       </w:r>
     </w:p>
     <w:p>
@@ -2308,9 +2316,9 @@
         <w:tblLook w:val="04A0" w:firstRow="1" w:lastRow="0" w:firstColumn="1" w:lastColumn="0" w:noHBand="0" w:noVBand="1"/>
       </w:tblPr>
       <w:tblGrid>
-        <w:gridCol w:w="1239"/>
-        <w:gridCol w:w="3750"/>
-        <w:gridCol w:w="4535"/>
+        <w:gridCol w:w="1198"/>
+        <w:gridCol w:w="3770"/>
+        <w:gridCol w:w="4994"/>
       </w:tblGrid>
       <w:tr>
         <w:trPr>
@@ -2318,7 +2326,7 @@
         </w:trPr>
         <w:tc>
           <w:tcPr>
-            <w:tcW w:w="1239" w:type="dxa"/>
+            <w:tcW w:w="1198" w:type="dxa"/>
             <w:shd w:val="clear" w:color="auto" w:fill="1E3A5F"/>
           </w:tcPr>
           <w:p>
@@ -2335,7 +2343,7 @@
         </w:tc>
         <w:tc>
           <w:tcPr>
-            <w:tcW w:w="3750" w:type="dxa"/>
+            <w:tcW w:w="3770" w:type="dxa"/>
             <w:shd w:val="clear" w:color="auto" w:fill="1E3A5F"/>
           </w:tcPr>
           <w:p>
@@ -2352,7 +2360,7 @@
         </w:tc>
         <w:tc>
           <w:tcPr>
-            <w:tcW w:w="4535" w:type="dxa"/>
+            <w:tcW w:w="4994" w:type="dxa"/>
             <w:shd w:val="clear" w:color="auto" w:fill="1E3A5F"/>
           </w:tcPr>
           <w:p>
@@ -2374,7 +2382,7 @@
         </w:trPr>
         <w:tc>
           <w:tcPr>
-            <w:tcW w:w="1239" w:type="dxa"/>
+            <w:tcW w:w="1198" w:type="dxa"/>
           </w:tcPr>
           <w:p>
             <w:r>
@@ -2389,7 +2397,7 @@
         </w:tc>
         <w:tc>
           <w:tcPr>
-            <w:tcW w:w="3750" w:type="dxa"/>
+            <w:tcW w:w="3770" w:type="dxa"/>
           </w:tcPr>
           <w:p>
             <w:r>
@@ -2404,7 +2412,7 @@
         </w:tc>
         <w:tc>
           <w:tcPr>
-            <w:tcW w:w="4535" w:type="dxa"/>
+            <w:tcW w:w="4994" w:type="dxa"/>
           </w:tcPr>
           <w:p>
             <w:r>
@@ -2424,7 +2432,7 @@
         </w:trPr>
         <w:tc>
           <w:tcPr>
-            <w:tcW w:w="1239" w:type="dxa"/>
+            <w:tcW w:w="1198" w:type="dxa"/>
             <w:shd w:val="clear" w:color="auto" w:fill="F4F7FA"/>
           </w:tcPr>
           <w:p>
@@ -2440,7 +2448,7 @@
         </w:tc>
         <w:tc>
           <w:tcPr>
-            <w:tcW w:w="3750" w:type="dxa"/>
+            <w:tcW w:w="3770" w:type="dxa"/>
             <w:shd w:val="clear" w:color="auto" w:fill="F4F7FA"/>
           </w:tcPr>
           <w:p>
@@ -2456,7 +2464,7 @@
         </w:tc>
         <w:tc>
           <w:tcPr>
-            <w:tcW w:w="4535" w:type="dxa"/>
+            <w:tcW w:w="4994" w:type="dxa"/>
             <w:shd w:val="clear" w:color="auto" w:fill="F4F7FA"/>
           </w:tcPr>
           <w:p>
@@ -2477,7 +2485,7 @@
         </w:trPr>
         <w:tc>
           <w:tcPr>
-            <w:tcW w:w="1239" w:type="dxa"/>
+            <w:tcW w:w="1198" w:type="dxa"/>
           </w:tcPr>
           <w:p>
             <w:r>
@@ -2492,7 +2500,7 @@
         </w:tc>
         <w:tc>
           <w:tcPr>
-            <w:tcW w:w="3750" w:type="dxa"/>
+            <w:tcW w:w="3770" w:type="dxa"/>
           </w:tcPr>
           <w:p>
             <w:r>
@@ -2507,7 +2515,7 @@
         </w:tc>
         <w:tc>
           <w:tcPr>
-            <w:tcW w:w="4535" w:type="dxa"/>
+            <w:tcW w:w="4994" w:type="dxa"/>
           </w:tcPr>
           <w:p>
             <w:r>
@@ -2527,7 +2535,7 @@
         </w:trPr>
         <w:tc>
           <w:tcPr>
-            <w:tcW w:w="1239" w:type="dxa"/>
+            <w:tcW w:w="1198" w:type="dxa"/>
             <w:shd w:val="clear" w:color="auto" w:fill="F4F7FA"/>
           </w:tcPr>
           <w:p>
@@ -2543,7 +2551,7 @@
         </w:tc>
         <w:tc>
           <w:tcPr>
-            <w:tcW w:w="3750" w:type="dxa"/>
+            <w:tcW w:w="3770" w:type="dxa"/>
             <w:shd w:val="clear" w:color="auto" w:fill="F4F7FA"/>
           </w:tcPr>
           <w:p>
@@ -2559,7 +2567,7 @@
         </w:tc>
         <w:tc>
           <w:tcPr>
-            <w:tcW w:w="4535" w:type="dxa"/>
+            <w:tcW w:w="4994" w:type="dxa"/>
             <w:shd w:val="clear" w:color="auto" w:fill="F4F7FA"/>
           </w:tcPr>
           <w:p>
@@ -2580,7 +2588,7 @@
         </w:trPr>
         <w:tc>
           <w:tcPr>
-            <w:tcW w:w="1239" w:type="dxa"/>
+            <w:tcW w:w="1198" w:type="dxa"/>
           </w:tcPr>
           <w:p>
             <w:r>
@@ -2595,7 +2603,7 @@
         </w:tc>
         <w:tc>
           <w:tcPr>
-            <w:tcW w:w="3750" w:type="dxa"/>
+            <w:tcW w:w="3770" w:type="dxa"/>
           </w:tcPr>
           <w:p>
             <w:r>
@@ -2610,7 +2618,7 @@
         </w:tc>
         <w:tc>
           <w:tcPr>
-            <w:tcW w:w="4535" w:type="dxa"/>
+            <w:tcW w:w="4994" w:type="dxa"/>
           </w:tcPr>
           <w:p>
             <w:r>
@@ -2630,7 +2638,7 @@
         </w:trPr>
         <w:tc>
           <w:tcPr>
-            <w:tcW w:w="1239" w:type="dxa"/>
+            <w:tcW w:w="1198" w:type="dxa"/>
             <w:shd w:val="clear" w:color="auto" w:fill="F4F7FA"/>
           </w:tcPr>
           <w:p>
@@ -2646,7 +2654,7 @@
         </w:tc>
         <w:tc>
           <w:tcPr>
-            <w:tcW w:w="3750" w:type="dxa"/>
+            <w:tcW w:w="3770" w:type="dxa"/>
             <w:shd w:val="clear" w:color="auto" w:fill="F4F7FA"/>
           </w:tcPr>
           <w:p>
@@ -2662,7 +2670,7 @@
         </w:tc>
         <w:tc>
           <w:tcPr>
-            <w:tcW w:w="4535" w:type="dxa"/>
+            <w:tcW w:w="4994" w:type="dxa"/>
             <w:shd w:val="clear" w:color="auto" w:fill="F4F7FA"/>
           </w:tcPr>
           <w:p>
@@ -2683,7 +2691,7 @@
         </w:trPr>
         <w:tc>
           <w:tcPr>
-            <w:tcW w:w="1239" w:type="dxa"/>
+            <w:tcW w:w="1198" w:type="dxa"/>
           </w:tcPr>
           <w:p>
             <w:r>
@@ -2698,7 +2706,7 @@
         </w:tc>
         <w:tc>
           <w:tcPr>
-            <w:tcW w:w="3750" w:type="dxa"/>
+            <w:tcW w:w="3770" w:type="dxa"/>
           </w:tcPr>
           <w:p>
             <w:r>
@@ -2713,7 +2721,7 @@
         </w:tc>
         <w:tc>
           <w:tcPr>
-            <w:tcW w:w="4535" w:type="dxa"/>
+            <w:tcW w:w="4994" w:type="dxa"/>
           </w:tcPr>
           <w:p>
             <w:r>
@@ -2739,6 +2747,7 @@
           <w:color w:val="1E4D6B"/>
           <w:sz w:val="24"/>
         </w:rPr>
+        <w:lastRenderedPageBreak/>
         <w:t>Architecture (learner in the center)</w:t>
       </w:r>
     </w:p>
@@ -2764,7 +2773,6 @@
           <w:rFonts w:ascii="Calibri" w:hAnsi="Calibri"/>
           <w:color w:val="1E4D6B"/>
         </w:rPr>
-        <w:lastRenderedPageBreak/>
         <w:t>10. Why missions are 2D and 3D is a lab</w:t>
       </w:r>
     </w:p>
@@ -3651,7 +3659,6 @@
           <w:rFonts w:ascii="Calibri" w:hAnsi="Calibri"/>
           <w:color w:val="1E4D6B"/>
         </w:rPr>
-        <w:lastRenderedPageBreak/>
         <w:t>14. Results and current status</w:t>
       </w:r>
     </w:p>
@@ -3669,21 +3676,21 @@
           <w:rFonts w:ascii="Calibri" w:eastAsia="Calibri" w:hAnsi="Calibri"/>
           <w:color w:val="1B2838"/>
         </w:rPr>
-        <w:t xml:space="preserve">As of August 2026 the landing catalog lists 28 live titles. Sixteen games pass an internal uniqueness bar. </w:t>
+        <w:t xml:space="preserve">As of August 2026 the landing catalog lists 28 live titles. Sixteen games pass an internal uniqueness bar (LEVEL_QA.md). </w:t>
       </w:r>
       <w:r>
         <w:rPr>
           <w:rFonts w:ascii="Calibri" w:eastAsia="Calibri" w:hAnsi="Calibri"/>
           <w:color w:val="1B2838"/>
         </w:rPr>
-        <w:t>Twenty-Five</w:t>
+        <w:t>Fifty-two</w:t>
       </w:r>
       <w:r>
         <w:rPr>
           <w:rFonts w:ascii="Calibri" w:eastAsia="Calibri" w:hAnsi="Calibri"/>
           <w:color w:val="1B2838"/>
         </w:rPr>
-        <w:t xml:space="preserve"> missions are finished to a playable standard. The remaining mission slots are structured stubs (same hub, coming-soon cards), which is a capacity choice, not a hidden crash. Specimen Lab ships with a catalog of classroom models and baked pin positions for animal cell, plant cell, heart, kidney, and city, plus an editor for the rest.</w:t>
+        <w:t xml:space="preserve"> missions are finished to a playable standard. Remaining catalog mission slots (228 of 280) are structured stubs (same hub, coming-soon cards), which is a capacity choice, not a hidden crash. Recent remodels include ICT Fundamentals Mission 1 (Bits: Inside the Machine's Kitchen): CPU, RAM, and storage through a kitchen metaphor with live switch-flipping and counter-vs-pantry interactions. Specimen Lab ships with a catalog of classroom models and baked pin positions for animal cell, plant cell, heart, kidney, and city, plus an editor for the rest.</w:t>
       </w:r>
     </w:p>
     <w:p>
@@ -3904,7 +3911,7 @@
           <w:rFonts w:ascii="Calibri" w:eastAsia="Calibri" w:hAnsi="Calibri"/>
           <w:color w:val="1B2838"/>
         </w:rPr>
-        <w:t>Some catalog titles are still shallow relative to Force Fighter.</w:t>
+        <w:t>Mission 2+ depth still varies by title; stub slots remain on the hub until authored.</w:t>
       </w:r>
     </w:p>
     <w:p>
@@ -4038,7 +4045,7 @@
                 <w:color w:val="1B2838"/>
                 <w:sz w:val="20"/>
               </w:rPr>
-              <w:t>28 titles, fluency gate, Specimen Lab, Groq fallback chain, optional Laravel</w:t>
+              <w:t>28 titles, 52 playable missions, fluency gate, Specimen Lab, Groq fallback chain, optional Laravel</w:t>
             </w:r>
           </w:p>
         </w:tc>
@@ -4172,7 +4179,6 @@
           <w:rFonts w:ascii="Calibri" w:hAnsi="Calibri"/>
           <w:color w:val="1E4D6B"/>
         </w:rPr>
-        <w:lastRenderedPageBreak/>
         <w:t>19. References</w:t>
       </w:r>
     </w:p>
@@ -4272,7 +4278,7 @@
 </file>
 
 <file path=word/endnotes.xml><?xml version="1.0" encoding="utf-8"?>
-<w:endnotes xmlns:wpc="http://schemas.microsoft.com/office/word/2010/wordprocessingCanvas" xmlns:cx="http://schemas.microsoft.com/office/drawing/2014/chartex" xmlns:cx1="http://schemas.microsoft.com/office/drawing/2015/9/8/chartex" xmlns:cx2="http://schemas.microsoft.com/office/drawing/2015/10/21/chartex" xmlns:cx3="http://schemas.microsoft.com/office/drawing/2016/5/9/chartex" xmlns:cx4="http://schemas.microsoft.com/office/drawing/2016/5/10/chartex" xmlns:cx5="http://schemas.microsoft.com/office/drawing/2016/5/11/chartex" xmlns:cx6="http://schemas.microsoft.com/office/drawing/2016/5/12/chartex" xmlns:cx7="http://schemas.microsoft.com/office/drawing/2016/5/13/chartex" xmlns:cx8="http://schemas.microsoft.com/office/drawing/2016/5/14/chartex" xmlns:mc="http://schemas.openxmlformats.org/markup-compatibility/2006" xmlns:aink="http://schemas.microsoft.com/office/drawing/2016/ink" xmlns:am3d="http://schemas.microsoft.com/office/drawing/2017/model3d" xmlns:o="urn:schemas-microsoft-com:office:office" xmlns:oel="http://schemas.microsoft.com/office/2019/extlst" xmlns:r="http://schemas.openxmlformats.org/officeDocument/2006/relationships" xmlns:m="http://schemas.openxmlformats.org/officeDocument/2006/math" xmlns:v="urn:schemas-microsoft-com:vml" xmlns:wp14="http://schemas.microsoft.com/office/word/2010/wordprocessingDrawing" xmlns:wp="http://schemas.openxmlformats.org/drawingml/2006/wordprocessingDrawing" xmlns:w10="urn:schemas-microsoft-com:office:word" xmlns:w="http://schemas.openxmlformats.org/wordprocessingml/2006/main" xmlns:w14="http://schemas.microsoft.com/office/word/2010/wordml" xmlns:w15="http://schemas.microsoft.com/office/word/2012/wordml" xmlns:w16cei="http://schemas.microsoft.com/office/word/2026/wordml/cei" xmlns:w16cex="http://schemas.microsoft.com/office/word/2018/wordml/cex" xmlns:w16cid="http://schemas.microsoft.com/office/word/2016/wordml/cid" xmlns:w16="http://schemas.microsoft.com/office/word/2018/wordml" xmlns:w16du="http://schemas.microsoft.com/office/word/2023/wordml/word16du" xmlns:w16sdtdh="http://schemas.microsoft.com/office/word/2020/wordml/sdtdatahash" xmlns:w16sdtfl="http://schemas.microsoft.com/office/word/2024/wordml/sdtformatlock" xmlns:w16se="http://schemas.microsoft.com/office/word/2015/wordml/symex" xmlns:wpg="http://schemas.microsoft.com/office/word/2010/wordprocessingGroup" xmlns:wpi="http://schemas.microsoft.com/office/word/2010/wordprocessingInk" xmlns:wne="http://schemas.microsoft.com/office/word/2006/wordml" xmlns:wps="http://schemas.microsoft.com/office/word/2010/wordprocessingShape" mc:Ignorable="w14 w15 w16se w16cid w16 w16cex w16sdtdh w16sdtfl w16du wp14">
+<w:endnotes xmlns:wpc="http://schemas.microsoft.com/office/word/2010/wordprocessingCanvas" xmlns:cx="http://schemas.microsoft.com/office/drawing/2014/chartex" xmlns:cx1="http://schemas.microsoft.com/office/drawing/2015/9/8/chartex" xmlns:cx2="http://schemas.microsoft.com/office/drawing/2015/10/21/chartex" xmlns:cx3="http://schemas.microsoft.com/office/drawing/2016/5/9/chartex" xmlns:cx4="http://schemas.microsoft.com/office/drawing/2016/5/10/chartex" xmlns:cx5="http://schemas.microsoft.com/office/drawing/2016/5/11/chartex" xmlns:cx6="http://schemas.microsoft.com/office/drawing/2016/5/12/chartex" xmlns:cx7="http://schemas.microsoft.com/office/drawing/2016/5/13/chartex" xmlns:cx8="http://schemas.microsoft.com/office/drawing/2016/5/14/chartex" xmlns:mc="http://schemas.openxmlformats.org/markup-compatibility/2006" xmlns:aink="http://schemas.microsoft.com/office/drawing/2016/ink" xmlns:am3d="http://schemas.microsoft.com/office/drawing/2017/model3d" xmlns:o="urn:schemas-microsoft-com:office:office" xmlns:oel="http://schemas.microsoft.com/office/2019/extlst" xmlns:r="http://schemas.openxmlformats.org/officeDocument/2006/relationships" xmlns:m="http://schemas.openxmlformats.org/officeDocument/2006/math" xmlns:v="urn:schemas-microsoft-com:vml" xmlns:wp14="http://schemas.microsoft.com/office/word/2010/wordprocessingDrawing" xmlns:wp="http://schemas.openxmlformats.org/drawingml/2006/wordprocessingDrawing" xmlns:w10="urn:schemas-microsoft-com:office:word" xmlns:w="http://schemas.openxmlformats.org/wordprocessingml/2006/main" xmlns:w14="http://schemas.microsoft.com/office/word/2010/wordml" xmlns:w15="http://schemas.microsoft.com/office/word/2012/wordml" xmlns:w16cex="http://schemas.microsoft.com/office/word/2018/wordml/cex" xmlns:w16cid="http://schemas.microsoft.com/office/word/2016/wordml/cid" xmlns:w16="http://schemas.microsoft.com/office/word/2018/wordml" xmlns:w16du="http://schemas.microsoft.com/office/word/2023/wordml/word16du" xmlns:w16sdtdh="http://schemas.microsoft.com/office/word/2020/wordml/sdtdatahash" xmlns:w16sdtfl="http://schemas.microsoft.com/office/word/2024/wordml/sdtformatlock" xmlns:w16se="http://schemas.microsoft.com/office/word/2015/wordml/symex" xmlns:wpg="http://schemas.microsoft.com/office/word/2010/wordprocessingGroup" xmlns:wpi="http://schemas.microsoft.com/office/word/2010/wordprocessingInk" xmlns:wne="http://schemas.microsoft.com/office/word/2006/wordml" xmlns:wps="http://schemas.microsoft.com/office/word/2010/wordprocessingShape" mc:Ignorable="w14 w15 w16se w16cid w16 w16cex w16sdtdh w16sdtfl w16du wp14">
   <w:endnote w:type="separator" w:id="-1">
     <w:p>
       <w:pPr>
@@ -4297,7 +4303,7 @@
 </file>
 
 <file path=word/footer1.xml><?xml version="1.0" encoding="utf-8"?>
-<w:ftr xmlns:wpc="http://schemas.microsoft.com/office/word/2010/wordprocessingCanvas" xmlns:cx="http://schemas.microsoft.com/office/drawing/2014/chartex" xmlns:cx1="http://schemas.microsoft.com/office/drawing/2015/9/8/chartex" xmlns:cx2="http://schemas.microsoft.com/office/drawing/2015/10/21/chartex" xmlns:cx3="http://schemas.microsoft.com/office/drawing/2016/5/9/chartex" xmlns:cx4="http://schemas.microsoft.com/office/drawing/2016/5/10/chartex" xmlns:cx5="http://schemas.microsoft.com/office/drawing/2016/5/11/chartex" xmlns:cx6="http://schemas.microsoft.com/office/drawing/2016/5/12/chartex" xmlns:cx7="http://schemas.microsoft.com/office/drawing/2016/5/13/chartex" xmlns:cx8="http://schemas.microsoft.com/office/drawing/2016/5/14/chartex" xmlns:mc="http://schemas.openxmlformats.org/markup-compatibility/2006" xmlns:aink="http://schemas.microsoft.com/office/drawing/2016/ink" xmlns:am3d="http://schemas.microsoft.com/office/drawing/2017/model3d" xmlns:o="urn:schemas-microsoft-com:office:office" xmlns:oel="http://schemas.microsoft.com/office/2019/extlst" xmlns:r="http://schemas.openxmlformats.org/officeDocument/2006/relationships" xmlns:m="http://schemas.openxmlformats.org/officeDocument/2006/math" xmlns:v="urn:schemas-microsoft-com:vml" xmlns:wp14="http://schemas.microsoft.com/office/word/2010/wordprocessingDrawing" xmlns:wp="http://schemas.openxmlformats.org/drawingml/2006/wordprocessingDrawing" xmlns:w10="urn:schemas-microsoft-com:office:word" xmlns:w="http://schemas.openxmlformats.org/wordprocessingml/2006/main" xmlns:w14="http://schemas.microsoft.com/office/word/2010/wordml" xmlns:w15="http://schemas.microsoft.com/office/word/2012/wordml" xmlns:w16cei="http://schemas.microsoft.com/office/word/2026/wordml/cei" xmlns:w16cex="http://schemas.microsoft.com/office/word/2018/wordml/cex" xmlns:w16cid="http://schemas.microsoft.com/office/word/2016/wordml/cid" xmlns:w16="http://schemas.microsoft.com/office/word/2018/wordml" xmlns:w16du="http://schemas.microsoft.com/office/word/2023/wordml/word16du" xmlns:w16sdtdh="http://schemas.microsoft.com/office/word/2020/wordml/sdtdatahash" xmlns:w16sdtfl="http://schemas.microsoft.com/office/word/2024/wordml/sdtformatlock" xmlns:w16se="http://schemas.microsoft.com/office/word/2015/wordml/symex" xmlns:wpg="http://schemas.microsoft.com/office/word/2010/wordprocessingGroup" xmlns:wpi="http://schemas.microsoft.com/office/word/2010/wordprocessingInk" xmlns:wne="http://schemas.microsoft.com/office/word/2006/wordml" xmlns:wps="http://schemas.microsoft.com/office/word/2010/wordprocessingShape" mc:Ignorable="w14 w15 w16se w16cid w16 w16cex w16sdtdh w16sdtfl w16du wp14">
+<w:ftr xmlns:wpc="http://schemas.microsoft.com/office/word/2010/wordprocessingCanvas" xmlns:cx="http://schemas.microsoft.com/office/drawing/2014/chartex" xmlns:cx1="http://schemas.microsoft.com/office/drawing/2015/9/8/chartex" xmlns:cx2="http://schemas.microsoft.com/office/drawing/2015/10/21/chartex" xmlns:cx3="http://schemas.microsoft.com/office/drawing/2016/5/9/chartex" xmlns:cx4="http://schemas.microsoft.com/office/drawing/2016/5/10/chartex" xmlns:cx5="http://schemas.microsoft.com/office/drawing/2016/5/11/chartex" xmlns:cx6="http://schemas.microsoft.com/office/drawing/2016/5/12/chartex" xmlns:cx7="http://schemas.microsoft.com/office/drawing/2016/5/13/chartex" xmlns:cx8="http://schemas.microsoft.com/office/drawing/2016/5/14/chartex" xmlns:mc="http://schemas.openxmlformats.org/markup-compatibility/2006" xmlns:aink="http://schemas.microsoft.com/office/drawing/2016/ink" xmlns:am3d="http://schemas.microsoft.com/office/drawing/2017/model3d" xmlns:o="urn:schemas-microsoft-com:office:office" xmlns:oel="http://schemas.microsoft.com/office/2019/extlst" xmlns:r="http://schemas.openxmlformats.org/officeDocument/2006/relationships" xmlns:m="http://schemas.openxmlformats.org/officeDocument/2006/math" xmlns:v="urn:schemas-microsoft-com:vml" xmlns:wp14="http://schemas.microsoft.com/office/word/2010/wordprocessingDrawing" xmlns:wp="http://schemas.openxmlformats.org/drawingml/2006/wordprocessingDrawing" xmlns:w10="urn:schemas-microsoft-com:office:word" xmlns:w="http://schemas.openxmlformats.org/wordprocessingml/2006/main" xmlns:w14="http://schemas.microsoft.com/office/word/2010/wordml" xmlns:w15="http://schemas.microsoft.com/office/word/2012/wordml" xmlns:w16cex="http://schemas.microsoft.com/office/word/2018/wordml/cex" xmlns:w16cid="http://schemas.microsoft.com/office/word/2016/wordml/cid" xmlns:w16="http://schemas.microsoft.com/office/word/2018/wordml" xmlns:w16du="http://schemas.microsoft.com/office/word/2023/wordml/word16du" xmlns:w16sdtdh="http://schemas.microsoft.com/office/word/2020/wordml/sdtdatahash" xmlns:w16sdtfl="http://schemas.microsoft.com/office/word/2024/wordml/sdtformatlock" xmlns:w16se="http://schemas.microsoft.com/office/word/2015/wordml/symex" xmlns:wpg="http://schemas.microsoft.com/office/word/2010/wordprocessingGroup" xmlns:wpi="http://schemas.microsoft.com/office/word/2010/wordprocessingInk" xmlns:wne="http://schemas.microsoft.com/office/word/2006/wordml" xmlns:wps="http://schemas.microsoft.com/office/word/2010/wordprocessingShape" mc:Ignorable="w14 w15 w16se w16cid w16 w16cex w16sdtdh w16sdtfl w16du wp14">
   <w:p>
     <w:pPr>
       <w:pStyle w:val="Footer"/>
@@ -4334,7 +4340,7 @@
 </file>
 
 <file path=word/footnotes.xml><?xml version="1.0" encoding="utf-8"?>
-<w:footnotes xmlns:wpc="http://schemas.microsoft.com/office/word/2010/wordprocessingCanvas" xmlns:cx="http://schemas.microsoft.com/office/drawing/2014/chartex" xmlns:cx1="http://schemas.microsoft.com/office/drawing/2015/9/8/chartex" xmlns:cx2="http://schemas.microsoft.com/office/drawing/2015/10/21/chartex" xmlns:cx3="http://schemas.microsoft.com/office/drawing/2016/5/9/chartex" xmlns:cx4="http://schemas.microsoft.com/office/drawing/2016/5/10/chartex" xmlns:cx5="http://schemas.microsoft.com/office/drawing/2016/5/11/chartex" xmlns:cx6="http://schemas.microsoft.com/office/drawing/2016/5/12/chartex" xmlns:cx7="http://schemas.microsoft.com/office/drawing/2016/5/13/chartex" xmlns:cx8="http://schemas.microsoft.com/office/drawing/2016/5/14/chartex" xmlns:mc="http://schemas.openxmlformats.org/markup-compatibility/2006" xmlns:aink="http://schemas.microsoft.com/office/drawing/2016/ink" xmlns:am3d="http://schemas.microsoft.com/office/drawing/2017/model3d" xmlns:o="urn:schemas-microsoft-com:office:office" xmlns:oel="http://schemas.microsoft.com/office/2019/extlst" xmlns:r="http://schemas.openxmlformats.org/officeDocument/2006/relationships" xmlns:m="http://schemas.openxmlformats.org/officeDocument/2006/math" xmlns:v="urn:schemas-microsoft-com:vml" xmlns:wp14="http://schemas.microsoft.com/office/word/2010/wordprocessingDrawing" xmlns:wp="http://schemas.openxmlformats.org/drawingml/2006/wordprocessingDrawing" xmlns:w10="urn:schemas-microsoft-com:office:word" xmlns:w="http://schemas.openxmlformats.org/wordprocessingml/2006/main" xmlns:w14="http://schemas.microsoft.com/office/word/2010/wordml" xmlns:w15="http://schemas.microsoft.com/office/word/2012/wordml" xmlns:w16cei="http://schemas.microsoft.com/office/word/2026/wordml/cei" xmlns:w16cex="http://schemas.microsoft.com/office/word/2018/wordml/cex" xmlns:w16cid="http://schemas.microsoft.com/office/word/2016/wordml/cid" xmlns:w16="http://schemas.microsoft.com/office/word/2018/wordml" xmlns:w16du="http://schemas.microsoft.com/office/word/2023/wordml/word16du" xmlns:w16sdtdh="http://schemas.microsoft.com/office/word/2020/wordml/sdtdatahash" xmlns:w16sdtfl="http://schemas.microsoft.com/office/word/2024/wordml/sdtformatlock" xmlns:w16se="http://schemas.microsoft.com/office/word/2015/wordml/symex" xmlns:wpg="http://schemas.microsoft.com/office/word/2010/wordprocessingGroup" xmlns:wpi="http://schemas.microsoft.com/office/word/2010/wordprocessingInk" xmlns:wne="http://schemas.microsoft.com/office/word/2006/wordml" xmlns:wps="http://schemas.microsoft.com/office/word/2010/wordprocessingShape" mc:Ignorable="w14 w15 w16se w16cid w16 w16cex w16sdtdh w16sdtfl w16du wp14">
+<w:footnotes xmlns:wpc="http://schemas.microsoft.com/office/word/2010/wordprocessingCanvas" xmlns:cx="http://schemas.microsoft.com/office/drawing/2014/chartex" xmlns:cx1="http://schemas.microsoft.com/office/drawing/2015/9/8/chartex" xmlns:cx2="http://schemas.microsoft.com/office/drawing/2015/10/21/chartex" xmlns:cx3="http://schemas.microsoft.com/office/drawing/2016/5/9/chartex" xmlns:cx4="http://schemas.microsoft.com/office/drawing/2016/5/10/chartex" xmlns:cx5="http://schemas.microsoft.com/office/drawing/2016/5/11/chartex" xmlns:cx6="http://schemas.microsoft.com/office/drawing/2016/5/12/chartex" xmlns:cx7="http://schemas.microsoft.com/office/drawing/2016/5/13/chartex" xmlns:cx8="http://schemas.microsoft.com/office/drawing/2016/5/14/chartex" xmlns:mc="http://schemas.openxmlformats.org/markup-compatibility/2006" xmlns:aink="http://schemas.microsoft.com/office/drawing/2016/ink" xmlns:am3d="http://schemas.microsoft.com/office/drawing/2017/model3d" xmlns:o="urn:schemas-microsoft-com:office:office" xmlns:oel="http://schemas.microsoft.com/office/2019/extlst" xmlns:r="http://schemas.openxmlformats.org/officeDocument/2006/relationships" xmlns:m="http://schemas.openxmlformats.org/officeDocument/2006/math" xmlns:v="urn:schemas-microsoft-com:vml" xmlns:wp14="http://schemas.microsoft.com/office/word/2010/wordprocessingDrawing" xmlns:wp="http://schemas.openxmlformats.org/drawingml/2006/wordprocessingDrawing" xmlns:w10="urn:schemas-microsoft-com:office:word" xmlns:w="http://schemas.openxmlformats.org/wordprocessingml/2006/main" xmlns:w14="http://schemas.microsoft.com/office/word/2010/wordml" xmlns:w15="http://schemas.microsoft.com/office/word/2012/wordml" xmlns:w16cex="http://schemas.microsoft.com/office/word/2018/wordml/cex" xmlns:w16cid="http://schemas.microsoft.com/office/word/2016/wordml/cid" xmlns:w16="http://schemas.microsoft.com/office/word/2018/wordml" xmlns:w16du="http://schemas.microsoft.com/office/word/2023/wordml/word16du" xmlns:w16sdtdh="http://schemas.microsoft.com/office/word/2020/wordml/sdtdatahash" xmlns:w16sdtfl="http://schemas.microsoft.com/office/word/2024/wordml/sdtformatlock" xmlns:w16se="http://schemas.microsoft.com/office/word/2015/wordml/symex" xmlns:wpg="http://schemas.microsoft.com/office/word/2010/wordprocessingGroup" xmlns:wpi="http://schemas.microsoft.com/office/word/2010/wordprocessingInk" xmlns:wne="http://schemas.microsoft.com/office/word/2006/wordml" xmlns:wps="http://schemas.microsoft.com/office/word/2010/wordprocessingShape" mc:Ignorable="w14 w15 w16se w16cid w16 w16cex w16sdtdh w16sdtfl w16du wp14">
   <w:footnote w:type="separator" w:id="-1">
     <w:p>
       <w:pPr>
@@ -4359,7 +4365,7 @@
 </file>
 
 <file path=word/header1.xml><?xml version="1.0" encoding="utf-8"?>
-<w:hdr xmlns:wpc="http://schemas.microsoft.com/office/word/2010/wordprocessingCanvas" xmlns:cx="http://schemas.microsoft.com/office/drawing/2014/chartex" xmlns:cx1="http://schemas.microsoft.com/office/drawing/2015/9/8/chartex" xmlns:cx2="http://schemas.microsoft.com/office/drawing/2015/10/21/chartex" xmlns:cx3="http://schemas.microsoft.com/office/drawing/2016/5/9/chartex" xmlns:cx4="http://schemas.microsoft.com/office/drawing/2016/5/10/chartex" xmlns:cx5="http://schemas.microsoft.com/office/drawing/2016/5/11/chartex" xmlns:cx6="http://schemas.microsoft.com/office/drawing/2016/5/12/chartex" xmlns:cx7="http://schemas.microsoft.com/office/drawing/2016/5/13/chartex" xmlns:cx8="http://schemas.microsoft.com/office/drawing/2016/5/14/chartex" xmlns:mc="http://schemas.openxmlformats.org/markup-compatibility/2006" xmlns:aink="http://schemas.microsoft.com/office/drawing/2016/ink" xmlns:am3d="http://schemas.microsoft.com/office/drawing/2017/model3d" xmlns:o="urn:schemas-microsoft-com:office:office" xmlns:oel="http://schemas.microsoft.com/office/2019/extlst" xmlns:r="http://schemas.openxmlformats.org/officeDocument/2006/relationships" xmlns:m="http://schemas.openxmlformats.org/officeDocument/2006/math" xmlns:v="urn:schemas-microsoft-com:vml" xmlns:wp14="http://schemas.microsoft.com/office/word/2010/wordprocessingDrawing" xmlns:wp="http://schemas.openxmlformats.org/drawingml/2006/wordprocessingDrawing" xmlns:w10="urn:schemas-microsoft-com:office:word" xmlns:w="http://schemas.openxmlformats.org/wordprocessingml/2006/main" xmlns:w14="http://schemas.microsoft.com/office/word/2010/wordml" xmlns:w15="http://schemas.microsoft.com/office/word/2012/wordml" xmlns:w16cei="http://schemas.microsoft.com/office/word/2026/wordml/cei" xmlns:w16cex="http://schemas.microsoft.com/office/word/2018/wordml/cex" xmlns:w16cid="http://schemas.microsoft.com/office/word/2016/wordml/cid" xmlns:w16="http://schemas.microsoft.com/office/word/2018/wordml" xmlns:w16du="http://schemas.microsoft.com/office/word/2023/wordml/word16du" xmlns:w16sdtdh="http://schemas.microsoft.com/office/word/2020/wordml/sdtdatahash" xmlns:w16sdtfl="http://schemas.microsoft.com/office/word/2024/wordml/sdtformatlock" xmlns:w16se="http://schemas.microsoft.com/office/word/2015/wordml/symex" xmlns:wpg="http://schemas.microsoft.com/office/word/2010/wordprocessingGroup" xmlns:wpi="http://schemas.microsoft.com/office/word/2010/wordprocessingInk" xmlns:wne="http://schemas.microsoft.com/office/word/2006/wordml" xmlns:wps="http://schemas.microsoft.com/office/word/2010/wordprocessingShape" mc:Ignorable="w14 w15 w16se w16cid w16 w16cex w16sdtdh w16sdtfl w16du wp14">
+<w:hdr xmlns:wpc="http://schemas.microsoft.com/office/word/2010/wordprocessingCanvas" xmlns:cx="http://schemas.microsoft.com/office/drawing/2014/chartex" xmlns:cx1="http://schemas.microsoft.com/office/drawing/2015/9/8/chartex" xmlns:cx2="http://schemas.microsoft.com/office/drawing/2015/10/21/chartex" xmlns:cx3="http://schemas.microsoft.com/office/drawing/2016/5/9/chartex" xmlns:cx4="http://schemas.microsoft.com/office/drawing/2016/5/10/chartex" xmlns:cx5="http://schemas.microsoft.com/office/drawing/2016/5/11/chartex" xmlns:cx6="http://schemas.microsoft.com/office/drawing/2016/5/12/chartex" xmlns:cx7="http://schemas.microsoft.com/office/drawing/2016/5/13/chartex" xmlns:cx8="http://schemas.microsoft.com/office/drawing/2016/5/14/chartex" xmlns:mc="http://schemas.openxmlformats.org/markup-compatibility/2006" xmlns:aink="http://schemas.microsoft.com/office/drawing/2016/ink" xmlns:am3d="http://schemas.microsoft.com/office/drawing/2017/model3d" xmlns:o="urn:schemas-microsoft-com:office:office" xmlns:oel="http://schemas.microsoft.com/office/2019/extlst" xmlns:r="http://schemas.openxmlformats.org/officeDocument/2006/relationships" xmlns:m="http://schemas.openxmlformats.org/officeDocument/2006/math" xmlns:v="urn:schemas-microsoft-com:vml" xmlns:wp14="http://schemas.microsoft.com/office/word/2010/wordprocessingDrawing" xmlns:wp="http://schemas.openxmlformats.org/drawingml/2006/wordprocessingDrawing" xmlns:w10="urn:schemas-microsoft-com:office:word" xmlns:w="http://schemas.openxmlformats.org/wordprocessingml/2006/main" xmlns:w14="http://schemas.microsoft.com/office/word/2010/wordml" xmlns:w15="http://schemas.microsoft.com/office/word/2012/wordml" xmlns:w16cex="http://schemas.microsoft.com/office/word/2018/wordml/cex" xmlns:w16cid="http://schemas.microsoft.com/office/word/2016/wordml/cid" xmlns:w16="http://schemas.microsoft.com/office/word/2018/wordml" xmlns:w16du="http://schemas.microsoft.com/office/word/2023/wordml/word16du" xmlns:w16sdtdh="http://schemas.microsoft.com/office/word/2020/wordml/sdtdatahash" xmlns:w16sdtfl="http://schemas.microsoft.com/office/word/2024/wordml/sdtformatlock" xmlns:w16se="http://schemas.microsoft.com/office/word/2015/wordml/symex" xmlns:wpg="http://schemas.microsoft.com/office/word/2010/wordprocessingGroup" xmlns:wpi="http://schemas.microsoft.com/office/word/2010/wordprocessingInk" xmlns:wne="http://schemas.microsoft.com/office/word/2006/wordml" xmlns:wps="http://schemas.microsoft.com/office/word/2010/wordprocessingShape" mc:Ignorable="w14 w15 w16se w16cid w16 w16cex w16sdtdh w16sdtfl w16du wp14">
   <w:p>
     <w:pPr>
       <w:pStyle w:val="Header"/>
@@ -4416,7 +4422,7 @@
 </file>
 
 <file path=word/numbering.xml><?xml version="1.0" encoding="utf-8"?>
-<w:numbering xmlns:wpc="http://schemas.microsoft.com/office/word/2010/wordprocessingCanvas" xmlns:cx="http://schemas.microsoft.com/office/drawing/2014/chartex" xmlns:cx1="http://schemas.microsoft.com/office/drawing/2015/9/8/chartex" xmlns:cx2="http://schemas.microsoft.com/office/drawing/2015/10/21/chartex" xmlns:cx3="http://schemas.microsoft.com/office/drawing/2016/5/9/chartex" xmlns:cx4="http://schemas.microsoft.com/office/drawing/2016/5/10/chartex" xmlns:cx5="http://schemas.microsoft.com/office/drawing/2016/5/11/chartex" xmlns:cx6="http://schemas.microsoft.com/office/drawing/2016/5/12/chartex" xmlns:cx7="http://schemas.microsoft.com/office/drawing/2016/5/13/chartex" xmlns:cx8="http://schemas.microsoft.com/office/drawing/2016/5/14/chartex" xmlns:mc="http://schemas.openxmlformats.org/markup-compatibility/2006" xmlns:aink="http://schemas.microsoft.com/office/drawing/2016/ink" xmlns:am3d="http://schemas.microsoft.com/office/drawing/2017/model3d" xmlns:o="urn:schemas-microsoft-com:office:office" xmlns:oel="http://schemas.microsoft.com/office/2019/extlst" xmlns:r="http://schemas.openxmlformats.org/officeDocument/2006/relationships" xmlns:m="http://schemas.openxmlformats.org/officeDocument/2006/math" xmlns:v="urn:schemas-microsoft-com:vml" xmlns:wp14="http://schemas.microsoft.com/office/word/2010/wordprocessingDrawing" xmlns:wp="http://schemas.openxmlformats.org/drawingml/2006/wordprocessingDrawing" xmlns:w10="urn:schemas-microsoft-com:office:word" xmlns:w="http://schemas.openxmlformats.org/wordprocessingml/2006/main" xmlns:w14="http://schemas.microsoft.com/office/word/2010/wordml" xmlns:w15="http://schemas.microsoft.com/office/word/2012/wordml" xmlns:w16cei="http://schemas.microsoft.com/office/word/2026/wordml/cei" xmlns:w16cex="http://schemas.microsoft.com/office/word/2018/wordml/cex" xmlns:w16cid="http://schemas.microsoft.com/office/word/2016/wordml/cid" xmlns:w16="http://schemas.microsoft.com/office/word/2018/wordml" xmlns:w16du="http://schemas.microsoft.com/office/word/2023/wordml/word16du" xmlns:w16sdtdh="http://schemas.microsoft.com/office/word/2020/wordml/sdtdatahash" xmlns:w16sdtfl="http://schemas.microsoft.com/office/word/2024/wordml/sdtformatlock" xmlns:w16se="http://schemas.microsoft.com/office/word/2015/wordml/symex" xmlns:wpg="http://schemas.microsoft.com/office/word/2010/wordprocessingGroup" xmlns:wpi="http://schemas.microsoft.com/office/word/2010/wordprocessingInk" xmlns:wne="http://schemas.microsoft.com/office/word/2006/wordml" xmlns:wps="http://schemas.microsoft.com/office/word/2010/wordprocessingShape" mc:Ignorable="w14 w15 w16se w16cid w16 w16cex w16sdtdh w16sdtfl w16du wp14">
+<w:numbering xmlns:wpc="http://schemas.microsoft.com/office/word/2010/wordprocessingCanvas" xmlns:cx="http://schemas.microsoft.com/office/drawing/2014/chartex" xmlns:cx1="http://schemas.microsoft.com/office/drawing/2015/9/8/chartex" xmlns:cx2="http://schemas.microsoft.com/office/drawing/2015/10/21/chartex" xmlns:cx3="http://schemas.microsoft.com/office/drawing/2016/5/9/chartex" xmlns:cx4="http://schemas.microsoft.com/office/drawing/2016/5/10/chartex" xmlns:cx5="http://schemas.microsoft.com/office/drawing/2016/5/11/chartex" xmlns:cx6="http://schemas.microsoft.com/office/drawing/2016/5/12/chartex" xmlns:cx7="http://schemas.microsoft.com/office/drawing/2016/5/13/chartex" xmlns:cx8="http://schemas.microsoft.com/office/drawing/2016/5/14/chartex" xmlns:mc="http://schemas.openxmlformats.org/markup-compatibility/2006" xmlns:aink="http://schemas.microsoft.com/office/drawing/2016/ink" xmlns:am3d="http://schemas.microsoft.com/office/drawing/2017/model3d" xmlns:o="urn:schemas-microsoft-com:office:office" xmlns:oel="http://schemas.microsoft.com/office/2019/extlst" xmlns:r="http://schemas.openxmlformats.org/officeDocument/2006/relationships" xmlns:m="http://schemas.openxmlformats.org/officeDocument/2006/math" xmlns:v="urn:schemas-microsoft-com:vml" xmlns:wp14="http://schemas.microsoft.com/office/word/2010/wordprocessingDrawing" xmlns:wp="http://schemas.openxmlformats.org/drawingml/2006/wordprocessingDrawing" xmlns:w10="urn:schemas-microsoft-com:office:word" xmlns:w="http://schemas.openxmlformats.org/wordprocessingml/2006/main" xmlns:w14="http://schemas.microsoft.com/office/word/2010/wordml" xmlns:w15="http://schemas.microsoft.com/office/word/2012/wordml" xmlns:w16cex="http://schemas.microsoft.com/office/word/2018/wordml/cex" xmlns:w16cid="http://schemas.microsoft.com/office/word/2016/wordml/cid" xmlns:w16="http://schemas.microsoft.com/office/word/2018/wordml" xmlns:w16du="http://schemas.microsoft.com/office/word/2023/wordml/word16du" xmlns:w16sdtdh="http://schemas.microsoft.com/office/word/2020/wordml/sdtdatahash" xmlns:w16sdtfl="http://schemas.microsoft.com/office/word/2024/wordml/sdtformatlock" xmlns:w16se="http://schemas.microsoft.com/office/word/2015/wordml/symex" xmlns:wpg="http://schemas.microsoft.com/office/word/2010/wordprocessingGroup" xmlns:wpi="http://schemas.microsoft.com/office/word/2010/wordprocessingInk" xmlns:wne="http://schemas.microsoft.com/office/word/2006/wordml" xmlns:wps="http://schemas.microsoft.com/office/word/2010/wordprocessingShape" mc:Ignorable="w14 w15 w16se w16cid w16 w16cex w16sdtdh w16sdtfl w16du wp14">
   <w:abstractNum w:abstractNumId="0" w15:restartNumberingAfterBreak="0">
     <w:nsid w:val="FFFFFF7C"/>
     <w:multiLevelType w:val="singleLevel"/>

</xml_diff>